<commit_message>
Added System Description and Technical Support Documents-draft versions
</commit_message>
<xml_diff>
--- a/Code Walkthrough (beta version) Rubric.docx
+++ b/Code Walkthrough (beta version) Rubric.docx
@@ -173,6 +173,9 @@
         </w:tc>
       </w:tr>
       <w:tr>
+        <w:trPr>
+          <w:trHeight w:val="315"/>
+        </w:trPr>
         <w:tc>
           <w:tcPr>
             <w:tcW w:w="9715" w:type="dxa"/>
@@ -192,6 +195,7 @@
                 <w:rFonts w:ascii="Bell MT" w:hAnsi="Bell MT" w:cs="Times New Roman"/>
                 <w:sz w:val="22"/>
                 <w:szCs w:val="22"/>
+                <w:highlight w:val="yellow"/>
               </w:rPr>
               <w:t>Code is modular, highly organized, with clear structure and consistent naming. Very easy to navigate.</w:t>
             </w:r>
@@ -467,7 +471,25 @@
                 <w:sz w:val="22"/>
                 <w:szCs w:val="22"/>
               </w:rPr>
-              <w:t>Some organization; modularity limited, difficult to follow in places.</w:t>
+              <w:t xml:space="preserve">Some </w:t>
+            </w:r>
+            <w:proofErr w:type="gramStart"/>
+            <w:r>
+              <w:rPr>
+                <w:rFonts w:ascii="Bell MT" w:hAnsi="Bell MT" w:cs="Times New Roman"/>
+                <w:sz w:val="22"/>
+                <w:szCs w:val="22"/>
+              </w:rPr>
+              <w:t>organization</w:t>
+            </w:r>
+            <w:proofErr w:type="gramEnd"/>
+            <w:r>
+              <w:rPr>
+                <w:rFonts w:ascii="Bell MT" w:hAnsi="Bell MT" w:cs="Times New Roman"/>
+                <w:sz w:val="22"/>
+                <w:szCs w:val="22"/>
+              </w:rPr>
+              <w:t>; modularity limited, difficult to follow in places.</w:t>
             </w:r>
           </w:p>
         </w:tc>
@@ -762,15 +784,17 @@
                 <w:rFonts w:ascii="Bell MT" w:hAnsi="Bell MT" w:cs="Times New Roman"/>
                 <w:sz w:val="22"/>
                 <w:szCs w:val="22"/>
-              </w:rPr>
-            </w:pPr>
-            <w:r>
-              <w:rPr>
-                <w:rFonts w:ascii="Bell MT" w:hAnsi="Bell MT" w:cs="Times New Roman"/>
-                <w:b/>
-                <w:bCs/>
-                <w:sz w:val="22"/>
-                <w:szCs w:val="22"/>
+                <w:highlight w:val="yellow"/>
+              </w:rPr>
+            </w:pPr>
+            <w:r>
+              <w:rPr>
+                <w:rFonts w:ascii="Bell MT" w:hAnsi="Bell MT" w:cs="Times New Roman"/>
+                <w:b/>
+                <w:bCs/>
+                <w:sz w:val="22"/>
+                <w:szCs w:val="22"/>
+                <w:highlight w:val="yellow"/>
               </w:rPr>
               <w:t>Exemplary (Full Points)</w:t>
             </w:r>
@@ -818,13 +842,15 @@
                 <w:rFonts w:ascii="Bell MT" w:hAnsi="Bell MT" w:cs="Times New Roman"/>
                 <w:sz w:val="22"/>
                 <w:szCs w:val="22"/>
-              </w:rPr>
-            </w:pPr>
-            <w:r>
-              <w:rPr>
-                <w:rFonts w:ascii="Bell MT" w:hAnsi="Bell MT" w:cs="Times New Roman"/>
-                <w:sz w:val="22"/>
-                <w:szCs w:val="22"/>
+                <w:highlight w:val="yellow"/>
+              </w:rPr>
+            </w:pPr>
+            <w:r>
+              <w:rPr>
+                <w:rFonts w:ascii="Bell MT" w:hAnsi="Bell MT" w:cs="Times New Roman"/>
+                <w:sz w:val="22"/>
+                <w:szCs w:val="22"/>
+                <w:highlight w:val="yellow"/>
               </w:rPr>
               <w:t>Thorough comments explain functions, logic, and modules. Code is very readable.</w:t>
             </w:r>
@@ -862,6 +888,7 @@
                 <w:rFonts w:ascii="Bell MT" w:hAnsi="Bell MT" w:cs="Times New Roman"/>
                 <w:sz w:val="20"/>
                 <w:szCs w:val="20"/>
+                <w:highlight w:val="yellow"/>
               </w:rPr>
             </w:pPr>
           </w:p>
@@ -1389,15 +1416,17 @@
                 <w:rFonts w:ascii="Bell MT" w:hAnsi="Bell MT" w:cs="Times New Roman"/>
                 <w:sz w:val="22"/>
                 <w:szCs w:val="22"/>
-              </w:rPr>
-            </w:pPr>
-            <w:r>
-              <w:rPr>
-                <w:rFonts w:ascii="Bell MT" w:hAnsi="Bell MT" w:cs="Times New Roman"/>
-                <w:b/>
-                <w:bCs/>
-                <w:sz w:val="22"/>
-                <w:szCs w:val="22"/>
+                <w:highlight w:val="yellow"/>
+              </w:rPr>
+            </w:pPr>
+            <w:r>
+              <w:rPr>
+                <w:rFonts w:ascii="Bell MT" w:hAnsi="Bell MT" w:cs="Times New Roman"/>
+                <w:b/>
+                <w:bCs/>
+                <w:sz w:val="22"/>
+                <w:szCs w:val="22"/>
+                <w:highlight w:val="yellow"/>
               </w:rPr>
               <w:t>Exemplary (Full Points)</w:t>
             </w:r>
@@ -1445,13 +1474,15 @@
                 <w:rFonts w:ascii="Bell MT" w:hAnsi="Bell MT" w:cs="Times New Roman"/>
                 <w:sz w:val="22"/>
                 <w:szCs w:val="22"/>
-              </w:rPr>
-            </w:pPr>
-            <w:r>
-              <w:rPr>
-                <w:rFonts w:ascii="Bell MT" w:hAnsi="Bell MT" w:cs="Times New Roman"/>
-                <w:sz w:val="22"/>
-                <w:szCs w:val="22"/>
+                <w:highlight w:val="yellow"/>
+              </w:rPr>
+            </w:pPr>
+            <w:r>
+              <w:rPr>
+                <w:rFonts w:ascii="Bell MT" w:hAnsi="Bell MT" w:cs="Times New Roman"/>
+                <w:sz w:val="22"/>
+                <w:szCs w:val="22"/>
+                <w:highlight w:val="yellow"/>
               </w:rPr>
               <w:t>All components function correctly; meets all requirements; passes tests.</w:t>
             </w:r>
@@ -1852,7 +1883,43 @@
                 <w:sz w:val="22"/>
                 <w:szCs w:val="22"/>
               </w:rPr>
-              <w:t>Major components do not function or requirements not met.</w:t>
+              <w:t xml:space="preserve">Major components do not </w:t>
+            </w:r>
+            <w:proofErr w:type="gramStart"/>
+            <w:r>
+              <w:rPr>
+                <w:rFonts w:ascii="Bell MT" w:hAnsi="Bell MT" w:cs="Times New Roman"/>
+                <w:sz w:val="22"/>
+                <w:szCs w:val="22"/>
+              </w:rPr>
+              <w:t>function</w:t>
+            </w:r>
+            <w:proofErr w:type="gramEnd"/>
+            <w:r>
+              <w:rPr>
+                <w:rFonts w:ascii="Bell MT" w:hAnsi="Bell MT" w:cs="Times New Roman"/>
+                <w:sz w:val="22"/>
+                <w:szCs w:val="22"/>
+              </w:rPr>
+              <w:t xml:space="preserve"> or requirements </w:t>
+            </w:r>
+            <w:proofErr w:type="gramStart"/>
+            <w:r>
+              <w:rPr>
+                <w:rFonts w:ascii="Bell MT" w:hAnsi="Bell MT" w:cs="Times New Roman"/>
+                <w:sz w:val="22"/>
+                <w:szCs w:val="22"/>
+              </w:rPr>
+              <w:t>not</w:t>
+            </w:r>
+            <w:proofErr w:type="gramEnd"/>
+            <w:r>
+              <w:rPr>
+                <w:rFonts w:ascii="Bell MT" w:hAnsi="Bell MT" w:cs="Times New Roman"/>
+                <w:sz w:val="22"/>
+                <w:szCs w:val="22"/>
+              </w:rPr>
+              <w:t xml:space="preserve"> met.</w:t>
             </w:r>
           </w:p>
         </w:tc>
@@ -2007,15 +2074,17 @@
                 <w:rFonts w:ascii="Bell MT" w:hAnsi="Bell MT" w:cs="Times New Roman"/>
                 <w:sz w:val="22"/>
                 <w:szCs w:val="22"/>
-              </w:rPr>
-            </w:pPr>
-            <w:r>
-              <w:rPr>
-                <w:rFonts w:ascii="Bell MT" w:hAnsi="Bell MT" w:cs="Times New Roman"/>
-                <w:b/>
-                <w:bCs/>
-                <w:sz w:val="22"/>
-                <w:szCs w:val="22"/>
+                <w:highlight w:val="yellow"/>
+              </w:rPr>
+            </w:pPr>
+            <w:r>
+              <w:rPr>
+                <w:rFonts w:ascii="Bell MT" w:hAnsi="Bell MT" w:cs="Times New Roman"/>
+                <w:b/>
+                <w:bCs/>
+                <w:sz w:val="22"/>
+                <w:szCs w:val="22"/>
+                <w:highlight w:val="yellow"/>
               </w:rPr>
               <w:t>Exemplary (Full Points)</w:t>
             </w:r>
@@ -2063,13 +2132,15 @@
                 <w:rFonts w:ascii="Bell MT" w:hAnsi="Bell MT" w:cs="Times New Roman"/>
                 <w:sz w:val="22"/>
                 <w:szCs w:val="22"/>
-              </w:rPr>
-            </w:pPr>
-            <w:r>
-              <w:rPr>
-                <w:rFonts w:ascii="Bell MT" w:hAnsi="Bell MT" w:cs="Times New Roman"/>
-                <w:sz w:val="22"/>
-                <w:szCs w:val="22"/>
+                <w:highlight w:val="yellow"/>
+              </w:rPr>
+            </w:pPr>
+            <w:r>
+              <w:rPr>
+                <w:rFonts w:ascii="Bell MT" w:hAnsi="Bell MT" w:cs="Times New Roman"/>
+                <w:sz w:val="22"/>
+                <w:szCs w:val="22"/>
+                <w:highlight w:val="yellow"/>
               </w:rPr>
               <w:t>Issues and bugs thoroughly tracked; commit history reflects full team collaboration.</w:t>
             </w:r>
@@ -2204,7 +2275,25 @@
                 <w:sz w:val="22"/>
                 <w:szCs w:val="22"/>
               </w:rPr>
-              <w:t>Issues and bugs mostly tracked; commit history shows most team participation.</w:t>
+              <w:t xml:space="preserve">Issues and bugs </w:t>
+            </w:r>
+            <w:proofErr w:type="gramStart"/>
+            <w:r>
+              <w:rPr>
+                <w:rFonts w:ascii="Bell MT" w:hAnsi="Bell MT" w:cs="Times New Roman"/>
+                <w:sz w:val="22"/>
+                <w:szCs w:val="22"/>
+              </w:rPr>
+              <w:t>mostly</w:t>
+            </w:r>
+            <w:proofErr w:type="gramEnd"/>
+            <w:r>
+              <w:rPr>
+                <w:rFonts w:ascii="Bell MT" w:hAnsi="Bell MT" w:cs="Times New Roman"/>
+                <w:sz w:val="22"/>
+                <w:szCs w:val="22"/>
+              </w:rPr>
+              <w:t xml:space="preserve"> tracked; commit history shows most team participation.</w:t>
             </w:r>
           </w:p>
         </w:tc>
@@ -2661,15 +2750,17 @@
                 <w:rFonts w:ascii="Bell MT" w:hAnsi="Bell MT" w:cs="Times New Roman"/>
                 <w:sz w:val="22"/>
                 <w:szCs w:val="22"/>
-              </w:rPr>
-            </w:pPr>
-            <w:r>
-              <w:rPr>
-                <w:rFonts w:ascii="Bell MT" w:hAnsi="Bell MT" w:cs="Times New Roman"/>
-                <w:b/>
-                <w:bCs/>
-                <w:sz w:val="22"/>
-                <w:szCs w:val="22"/>
+                <w:highlight w:val="yellow"/>
+              </w:rPr>
+            </w:pPr>
+            <w:r>
+              <w:rPr>
+                <w:rFonts w:ascii="Bell MT" w:hAnsi="Bell MT" w:cs="Times New Roman"/>
+                <w:b/>
+                <w:bCs/>
+                <w:sz w:val="22"/>
+                <w:szCs w:val="22"/>
+                <w:highlight w:val="yellow"/>
               </w:rPr>
               <w:t>Exemplary (Full Points)</w:t>
             </w:r>
@@ -2717,13 +2808,15 @@
                 <w:rFonts w:ascii="Bell MT" w:hAnsi="Bell MT" w:cs="Times New Roman"/>
                 <w:sz w:val="22"/>
                 <w:szCs w:val="22"/>
-              </w:rPr>
-            </w:pPr>
-            <w:r>
-              <w:rPr>
-                <w:rFonts w:ascii="Bell MT" w:hAnsi="Bell MT" w:cs="Times New Roman"/>
-                <w:sz w:val="22"/>
-                <w:szCs w:val="22"/>
+                <w:highlight w:val="yellow"/>
+              </w:rPr>
+            </w:pPr>
+            <w:r>
+              <w:rPr>
+                <w:rFonts w:ascii="Bell MT" w:hAnsi="Bell MT" w:cs="Times New Roman"/>
+                <w:sz w:val="22"/>
+                <w:szCs w:val="22"/>
+                <w:highlight w:val="yellow"/>
               </w:rPr>
               <w:t>All members contribute equally; communicate effectively; resolve conflicts collaboratively.</w:t>
             </w:r>
@@ -3279,15 +3372,17 @@
                 <w:rFonts w:ascii="Bell MT" w:hAnsi="Bell MT" w:cs="Times New Roman"/>
                 <w:sz w:val="22"/>
                 <w:szCs w:val="22"/>
-              </w:rPr>
-            </w:pPr>
-            <w:r>
-              <w:rPr>
-                <w:rFonts w:ascii="Bell MT" w:hAnsi="Bell MT" w:cs="Times New Roman"/>
-                <w:b/>
-                <w:bCs/>
-                <w:sz w:val="22"/>
-                <w:szCs w:val="22"/>
+                <w:highlight w:val="yellow"/>
+              </w:rPr>
+            </w:pPr>
+            <w:r>
+              <w:rPr>
+                <w:rFonts w:ascii="Bell MT" w:hAnsi="Bell MT" w:cs="Times New Roman"/>
+                <w:b/>
+                <w:bCs/>
+                <w:sz w:val="22"/>
+                <w:szCs w:val="22"/>
+                <w:highlight w:val="yellow"/>
               </w:rPr>
               <w:t>Exemplary (Full Points)</w:t>
             </w:r>
@@ -3335,13 +3430,15 @@
                 <w:rFonts w:ascii="Bell MT" w:hAnsi="Bell MT" w:cs="Times New Roman"/>
                 <w:sz w:val="22"/>
                 <w:szCs w:val="22"/>
-              </w:rPr>
-            </w:pPr>
-            <w:r>
-              <w:rPr>
-                <w:rFonts w:ascii="Bell MT" w:hAnsi="Bell MT" w:cs="Times New Roman"/>
-                <w:sz w:val="22"/>
-                <w:szCs w:val="22"/>
+                <w:highlight w:val="yellow"/>
+              </w:rPr>
+            </w:pPr>
+            <w:r>
+              <w:rPr>
+                <w:rFonts w:ascii="Bell MT" w:hAnsi="Bell MT" w:cs="Times New Roman"/>
+                <w:sz w:val="22"/>
+                <w:szCs w:val="22"/>
+                <w:highlight w:val="yellow"/>
               </w:rPr>
               <w:t>Code follows industry standards; efficient, secure, maintainable.</w:t>
             </w:r>
@@ -3897,15 +3994,17 @@
                 <w:rFonts w:ascii="Bell MT" w:hAnsi="Bell MT" w:cs="Times New Roman"/>
                 <w:sz w:val="22"/>
                 <w:szCs w:val="22"/>
-              </w:rPr>
-            </w:pPr>
-            <w:r>
-              <w:rPr>
-                <w:rFonts w:ascii="Bell MT" w:hAnsi="Bell MT" w:cs="Times New Roman"/>
-                <w:b/>
-                <w:bCs/>
-                <w:sz w:val="22"/>
-                <w:szCs w:val="22"/>
+                <w:highlight w:val="yellow"/>
+              </w:rPr>
+            </w:pPr>
+            <w:r>
+              <w:rPr>
+                <w:rFonts w:ascii="Bell MT" w:hAnsi="Bell MT" w:cs="Times New Roman"/>
+                <w:b/>
+                <w:bCs/>
+                <w:sz w:val="22"/>
+                <w:szCs w:val="22"/>
+                <w:highlight w:val="yellow"/>
               </w:rPr>
               <w:t>Exemplary (Full Points)</w:t>
             </w:r>
@@ -3953,13 +4052,15 @@
                 <w:rFonts w:ascii="Bell MT" w:hAnsi="Bell MT" w:cs="Times New Roman"/>
                 <w:sz w:val="22"/>
                 <w:szCs w:val="22"/>
-              </w:rPr>
-            </w:pPr>
-            <w:r>
-              <w:rPr>
-                <w:rFonts w:ascii="Bell MT" w:hAnsi="Bell MT" w:cs="Times New Roman"/>
-                <w:sz w:val="22"/>
-                <w:szCs w:val="22"/>
+                <w:highlight w:val="yellow"/>
+              </w:rPr>
+            </w:pPr>
+            <w:r>
+              <w:rPr>
+                <w:rFonts w:ascii="Bell MT" w:hAnsi="Bell MT" w:cs="Times New Roman"/>
+                <w:sz w:val="22"/>
+                <w:szCs w:val="22"/>
+                <w:highlight w:val="yellow"/>
               </w:rPr>
               <w:t>Creative solutions; problems solved effectively and efficiently; alternatives considered.</w:t>
             </w:r>
@@ -4515,15 +4616,17 @@
                 <w:rFonts w:ascii="Bell MT" w:hAnsi="Bell MT" w:cs="Times New Roman"/>
                 <w:sz w:val="22"/>
                 <w:szCs w:val="22"/>
-              </w:rPr>
-            </w:pPr>
-            <w:r>
-              <w:rPr>
-                <w:rFonts w:ascii="Bell MT" w:hAnsi="Bell MT" w:cs="Times New Roman"/>
-                <w:b/>
-                <w:bCs/>
-                <w:sz w:val="22"/>
-                <w:szCs w:val="22"/>
+                <w:highlight w:val="yellow"/>
+              </w:rPr>
+            </w:pPr>
+            <w:r>
+              <w:rPr>
+                <w:rFonts w:ascii="Bell MT" w:hAnsi="Bell MT" w:cs="Times New Roman"/>
+                <w:b/>
+                <w:bCs/>
+                <w:sz w:val="22"/>
+                <w:szCs w:val="22"/>
+                <w:highlight w:val="yellow"/>
               </w:rPr>
               <w:t>Exemplary (Full Points)</w:t>
             </w:r>
@@ -4571,13 +4674,15 @@
                 <w:rFonts w:ascii="Bell MT" w:hAnsi="Bell MT" w:cs="Times New Roman"/>
                 <w:sz w:val="22"/>
                 <w:szCs w:val="22"/>
-              </w:rPr>
-            </w:pPr>
-            <w:r>
-              <w:rPr>
-                <w:rFonts w:ascii="Bell MT" w:hAnsi="Bell MT" w:cs="Times New Roman"/>
-                <w:sz w:val="22"/>
-                <w:szCs w:val="22"/>
+                <w:highlight w:val="yellow"/>
+              </w:rPr>
+            </w:pPr>
+            <w:r>
+              <w:rPr>
+                <w:rFonts w:ascii="Bell MT" w:hAnsi="Bell MT" w:cs="Times New Roman"/>
+                <w:sz w:val="22"/>
+                <w:szCs w:val="22"/>
+                <w:highlight w:val="yellow"/>
               </w:rPr>
               <w:t>Team presents all components confidently; answers questions thoroughly; materials ready.</w:t>
             </w:r>
@@ -5750,6 +5855,7 @@
   <w:style w:type="character" w:default="1" w:styleId="DefaultParagraphFont">
     <w:name w:val="Default Paragraph Font"/>
     <w:uiPriority w:val="1"/>
+    <w:semiHidden/>
     <w:unhideWhenUsed/>
   </w:style>
   <w:style w:type="table" w:default="1" w:styleId="TableNormal">

</xml_diff>